<commit_message>
Regel-triage 0.17.0: ærligt dækningsbillede (scope-klassifikation, 92/143 fil-validerbare) + docx selvberegnende
</commit_message>
<xml_diff>
--- a/docs/Pillar2-Validator_Godkendelses-overblik.docx
+++ b/docs/Pillar2-Validator_Godkendelses-overblik.docx
@@ -974,7 +974,7 @@
                 <w:b w:val="false"/>
                 <w:bCs w:val="false"/>
               </w:rPr>
-              <w:t xml:space="preserve">78/163 regler eksekverbare (15 beregningsregler); datadrevet motor dækker alle check-kategorier.</w:t>
+              <w:t xml:space="preserve">87/163 regler eksekverbare (19 beregningsregler); datadrevet motor dækker alle check-kategorier.</w:t>
             </w:r>
           </w:p>
         </w:tc>
@@ -1625,7 +1625,542 @@
         <w:pStyle w:val="Heading1"/>
       </w:pPr>
       <w:r>
-        <w:t xml:space="preserve">4. Åbne punkter (kræver EY / eksterne beslutninger)</w:t>
+        <w:t xml:space="preserve">4. Regeldækning (ærligt billede)</w:t>
+      </w:r>
+    </w:p>
+    <w:p>
+      <w:pPr>
+        <w:spacing w:after="120"/>
+      </w:pPr>
+      <w:r>
+        <w:t xml:space="preserve">Det officielle katalog rummer 163 regler. De er ikke alle beregnet til et fil-valideringsværktøj: en del er transmissions-/modtagerstatus eller afhænger af besked-/korrektionshistorik på tværs af indsendelser. Fordelingen er:</w:t>
+      </w:r>
+    </w:p>
+    <w:tbl>
+      <w:tblPr>
+        <w:tblW w:type="dxa" w:w="9360"/>
+        <w:tblBorders>
+          <w:top w:val="single" w:color="auto" w:sz="4"/>
+          <w:left w:val="single" w:color="auto" w:sz="4"/>
+          <w:bottom w:val="single" w:color="auto" w:sz="4"/>
+          <w:right w:val="single" w:color="auto" w:sz="4"/>
+          <w:insideH w:val="single" w:color="auto" w:sz="4"/>
+          <w:insideV w:val="single" w:color="auto" w:sz="4"/>
+        </w:tblBorders>
+      </w:tblPr>
+      <w:tblGrid>
+        <w:gridCol w:w="3100"/>
+        <w:gridCol w:w="1000"/>
+        <w:gridCol w:w="5260"/>
+      </w:tblGrid>
+      <w:tr>
+        <w:trPr>
+          <w:tblHeader/>
+        </w:trPr>
+        <w:tc>
+          <w:tcPr>
+            <w:tcW w:type="dxa" w:w="3100"/>
+            <w:tcBorders>
+              <w:top w:val="single" w:color="CCCCCC" w:sz="1"/>
+              <w:left w:val="single" w:color="CCCCCC" w:sz="1"/>
+              <w:bottom w:val="single" w:color="CCCCCC" w:sz="1"/>
+              <w:right w:val="single" w:color="CCCCCC" w:sz="1"/>
+            </w:tcBorders>
+            <w:shd w:fill="1B365D" w:color="auto" w:val="clear"/>
+            <w:tcMar>
+              <w:top w:type="dxa" w:w="80"/>
+              <w:left w:type="dxa" w:w="120"/>
+              <w:bottom w:type="dxa" w:w="80"/>
+              <w:right w:type="dxa" w:w="120"/>
+            </w:tcMar>
+          </w:tcPr>
+          <w:p>
+            <w:r>
+              <w:rPr>
+                <w:b/>
+                <w:bCs/>
+                <w:color w:val="FFFFFF"/>
+              </w:rPr>
+              <w:t xml:space="preserve">Kategori</w:t>
+            </w:r>
+          </w:p>
+        </w:tc>
+        <w:tc>
+          <w:tcPr>
+            <w:tcW w:type="dxa" w:w="1000"/>
+            <w:tcBorders>
+              <w:top w:val="single" w:color="CCCCCC" w:sz="1"/>
+              <w:left w:val="single" w:color="CCCCCC" w:sz="1"/>
+              <w:bottom w:val="single" w:color="CCCCCC" w:sz="1"/>
+              <w:right w:val="single" w:color="CCCCCC" w:sz="1"/>
+            </w:tcBorders>
+            <w:shd w:fill="1B365D" w:color="auto" w:val="clear"/>
+            <w:tcMar>
+              <w:top w:type="dxa" w:w="80"/>
+              <w:left w:type="dxa" w:w="120"/>
+              <w:bottom w:type="dxa" w:w="80"/>
+              <w:right w:type="dxa" w:w="120"/>
+            </w:tcMar>
+          </w:tcPr>
+          <w:p>
+            <w:r>
+              <w:rPr>
+                <w:b/>
+                <w:bCs/>
+                <w:color w:val="FFFFFF"/>
+              </w:rPr>
+              <w:t xml:space="preserve">Antal</w:t>
+            </w:r>
+          </w:p>
+        </w:tc>
+        <w:tc>
+          <w:tcPr>
+            <w:tcW w:type="dxa" w:w="5260"/>
+            <w:tcBorders>
+              <w:top w:val="single" w:color="CCCCCC" w:sz="1"/>
+              <w:left w:val="single" w:color="CCCCCC" w:sz="1"/>
+              <w:bottom w:val="single" w:color="CCCCCC" w:sz="1"/>
+              <w:right w:val="single" w:color="CCCCCC" w:sz="1"/>
+            </w:tcBorders>
+            <w:shd w:fill="1B365D" w:color="auto" w:val="clear"/>
+            <w:tcMar>
+              <w:top w:type="dxa" w:w="80"/>
+              <w:left w:type="dxa" w:w="120"/>
+              <w:bottom w:type="dxa" w:w="80"/>
+              <w:right w:type="dxa" w:w="120"/>
+            </w:tcMar>
+          </w:tcPr>
+          <w:p>
+            <w:r>
+              <w:rPr>
+                <w:b/>
+                <w:bCs/>
+                <w:color w:val="FFFFFF"/>
+              </w:rPr>
+              <w:t xml:space="preserve">Forklaring</w:t>
+            </w:r>
+          </w:p>
+        </w:tc>
+      </w:tr>
+      <w:tr>
+        <w:tc>
+          <w:tcPr>
+            <w:tcW w:type="dxa" w:w="3100"/>
+            <w:tcBorders>
+              <w:top w:val="single" w:color="CCCCCC" w:sz="1"/>
+              <w:left w:val="single" w:color="CCCCCC" w:sz="1"/>
+              <w:bottom w:val="single" w:color="CCCCCC" w:sz="1"/>
+              <w:right w:val="single" w:color="CCCCCC" w:sz="1"/>
+            </w:tcBorders>
+            <w:tcMar>
+              <w:top w:type="dxa" w:w="80"/>
+              <w:left w:type="dxa" w:w="120"/>
+              <w:bottom w:type="dxa" w:w="80"/>
+              <w:right w:type="dxa" w:w="120"/>
+            </w:tcMar>
+          </w:tcPr>
+          <w:p>
+            <w:r>
+              <w:rPr>
+                <w:b w:val="false"/>
+                <w:bCs w:val="false"/>
+              </w:rPr>
+              <w:t xml:space="preserve">Eksekverbare kontroller</w:t>
+            </w:r>
+          </w:p>
+        </w:tc>
+        <w:tc>
+          <w:tcPr>
+            <w:tcW w:type="dxa" w:w="1000"/>
+            <w:tcBorders>
+              <w:top w:val="single" w:color="CCCCCC" w:sz="1"/>
+              <w:left w:val="single" w:color="CCCCCC" w:sz="1"/>
+              <w:bottom w:val="single" w:color="CCCCCC" w:sz="1"/>
+              <w:right w:val="single" w:color="CCCCCC" w:sz="1"/>
+            </w:tcBorders>
+            <w:tcMar>
+              <w:top w:type="dxa" w:w="80"/>
+              <w:left w:type="dxa" w:w="120"/>
+              <w:bottom w:type="dxa" w:w="80"/>
+              <w:right w:type="dxa" w:w="120"/>
+            </w:tcMar>
+          </w:tcPr>
+          <w:p>
+            <w:r>
+              <w:rPr>
+                <w:b w:val="false"/>
+                <w:bCs w:val="false"/>
+              </w:rPr>
+              <w:t xml:space="preserve">87</w:t>
+            </w:r>
+          </w:p>
+        </w:tc>
+        <w:tc>
+          <w:tcPr>
+            <w:tcW w:type="dxa" w:w="5260"/>
+            <w:tcBorders>
+              <w:top w:val="single" w:color="CCCCCC" w:sz="1"/>
+              <w:left w:val="single" w:color="CCCCCC" w:sz="1"/>
+              <w:bottom w:val="single" w:color="CCCCCC" w:sz="1"/>
+              <w:right w:val="single" w:color="CCCCCC" w:sz="1"/>
+            </w:tcBorders>
+            <w:tcMar>
+              <w:top w:type="dxa" w:w="80"/>
+              <w:left w:type="dxa" w:w="120"/>
+              <w:bottom w:type="dxa" w:w="80"/>
+              <w:right w:type="dxa" w:w="120"/>
+            </w:tcMar>
+          </w:tcPr>
+          <w:p>
+            <w:r>
+              <w:rPr>
+                <w:b w:val="false"/>
+                <w:bCs w:val="false"/>
+              </w:rPr>
+              <w:t xml:space="preserve">Kodet i regelmotoren og verificeret af valideringssuiten (én planted defekt pr. kontrol).</w:t>
+            </w:r>
+          </w:p>
+        </w:tc>
+      </w:tr>
+      <w:tr>
+        <w:tc>
+          <w:tcPr>
+            <w:tcW w:type="dxa" w:w="3100"/>
+            <w:tcBorders>
+              <w:top w:val="single" w:color="CCCCCC" w:sz="1"/>
+              <w:left w:val="single" w:color="CCCCCC" w:sz="1"/>
+              <w:bottom w:val="single" w:color="CCCCCC" w:sz="1"/>
+              <w:right w:val="single" w:color="CCCCCC" w:sz="1"/>
+            </w:tcBorders>
+            <w:tcMar>
+              <w:top w:type="dxa" w:w="80"/>
+              <w:left w:type="dxa" w:w="120"/>
+              <w:bottom w:type="dxa" w:w="80"/>
+              <w:right w:type="dxa" w:w="120"/>
+            </w:tcMar>
+          </w:tcPr>
+          <w:p>
+            <w:r>
+              <w:rPr>
+                <w:b w:val="false"/>
+                <w:bCs w:val="false"/>
+              </w:rPr>
+              <w:t xml:space="preserve">Dækket af ækvivalent regel</w:t>
+            </w:r>
+          </w:p>
+        </w:tc>
+        <w:tc>
+          <w:tcPr>
+            <w:tcW w:type="dxa" w:w="1000"/>
+            <w:tcBorders>
+              <w:top w:val="single" w:color="CCCCCC" w:sz="1"/>
+              <w:left w:val="single" w:color="CCCCCC" w:sz="1"/>
+              <w:bottom w:val="single" w:color="CCCCCC" w:sz="1"/>
+              <w:right w:val="single" w:color="CCCCCC" w:sz="1"/>
+            </w:tcBorders>
+            <w:tcMar>
+              <w:top w:type="dxa" w:w="80"/>
+              <w:left w:type="dxa" w:w="120"/>
+              <w:bottom w:type="dxa" w:w="80"/>
+              <w:right w:type="dxa" w:w="120"/>
+            </w:tcMar>
+          </w:tcPr>
+          <w:p>
+            <w:r>
+              <w:rPr>
+                <w:b w:val="false"/>
+                <w:bCs w:val="false"/>
+              </w:rPr>
+              <w:t xml:space="preserve">5</w:t>
+            </w:r>
+          </w:p>
+        </w:tc>
+        <w:tc>
+          <w:tcPr>
+            <w:tcW w:type="dxa" w:w="5260"/>
+            <w:tcBorders>
+              <w:top w:val="single" w:color="CCCCCC" w:sz="1"/>
+              <w:left w:val="single" w:color="CCCCCC" w:sz="1"/>
+              <w:bottom w:val="single" w:color="CCCCCC" w:sz="1"/>
+              <w:right w:val="single" w:color="CCCCCC" w:sz="1"/>
+            </w:tcBorders>
+            <w:tcMar>
+              <w:top w:type="dxa" w:w="80"/>
+              <w:left w:type="dxa" w:w="120"/>
+              <w:bottom w:type="dxa" w:w="80"/>
+              <w:right w:type="dxa" w:w="120"/>
+            </w:tcMar>
+          </w:tcPr>
+          <w:p>
+            <w:r>
+              <w:rPr>
+                <w:b w:val="false"/>
+                <w:bCs w:val="false"/>
+              </w:rPr>
+              <w:t xml:space="preserve">Samme semantik håndhæves allerede af en eksekverbar regel.</w:t>
+            </w:r>
+          </w:p>
+        </w:tc>
+      </w:tr>
+      <w:tr>
+        <w:tc>
+          <w:tcPr>
+            <w:tcW w:type="dxa" w:w="3100"/>
+            <w:tcBorders>
+              <w:top w:val="single" w:color="CCCCCC" w:sz="1"/>
+              <w:left w:val="single" w:color="CCCCCC" w:sz="1"/>
+              <w:bottom w:val="single" w:color="CCCCCC" w:sz="1"/>
+              <w:right w:val="single" w:color="CCCCCC" w:sz="1"/>
+            </w:tcBorders>
+            <w:tcMar>
+              <w:top w:type="dxa" w:w="80"/>
+              <w:left w:type="dxa" w:w="120"/>
+              <w:bottom w:type="dxa" w:w="80"/>
+              <w:right w:type="dxa" w:w="120"/>
+            </w:tcMar>
+          </w:tcPr>
+          <w:p>
+            <w:r>
+              <w:rPr>
+                <w:b w:val="false"/>
+                <w:bCs w:val="false"/>
+              </w:rPr>
+              <w:t xml:space="preserve">Kandidater (kan kodes)</w:t>
+            </w:r>
+          </w:p>
+        </w:tc>
+        <w:tc>
+          <w:tcPr>
+            <w:tcW w:type="dxa" w:w="1000"/>
+            <w:tcBorders>
+              <w:top w:val="single" w:color="CCCCCC" w:sz="1"/>
+              <w:left w:val="single" w:color="CCCCCC" w:sz="1"/>
+              <w:bottom w:val="single" w:color="CCCCCC" w:sz="1"/>
+              <w:right w:val="single" w:color="CCCCCC" w:sz="1"/>
+            </w:tcBorders>
+            <w:tcMar>
+              <w:top w:type="dxa" w:w="80"/>
+              <w:left w:type="dxa" w:w="120"/>
+              <w:bottom w:type="dxa" w:w="80"/>
+              <w:right w:type="dxa" w:w="120"/>
+            </w:tcMar>
+          </w:tcPr>
+          <w:p>
+            <w:r>
+              <w:rPr>
+                <w:b w:val="false"/>
+                <w:bCs w:val="false"/>
+              </w:rPr>
+              <w:t xml:space="preserve">51</w:t>
+            </w:r>
+          </w:p>
+        </w:tc>
+        <w:tc>
+          <w:tcPr>
+            <w:tcW w:type="dxa" w:w="5260"/>
+            <w:tcBorders>
+              <w:top w:val="single" w:color="CCCCCC" w:sz="1"/>
+              <w:left w:val="single" w:color="CCCCCC" w:sz="1"/>
+              <w:bottom w:val="single" w:color="CCCCCC" w:sz="1"/>
+              <w:right w:val="single" w:color="CCCCCC" w:sz="1"/>
+            </w:tcBorders>
+            <w:tcMar>
+              <w:top w:type="dxa" w:w="80"/>
+              <w:left w:type="dxa" w:w="120"/>
+              <w:bottom w:type="dxa" w:w="80"/>
+              <w:right w:type="dxa" w:w="120"/>
+            </w:tcMar>
+          </w:tcPr>
+          <w:p>
+            <w:r>
+              <w:rPr>
+                <w:b w:val="false"/>
+                <w:bCs w:val="false"/>
+              </w:rPr>
+              <w:t xml:space="preserve">Fil-validerbare regler der endnu ikke er kodet; kodes batch-vis.</w:t>
+            </w:r>
+          </w:p>
+        </w:tc>
+      </w:tr>
+      <w:tr>
+        <w:tc>
+          <w:tcPr>
+            <w:tcW w:type="dxa" w:w="3100"/>
+            <w:tcBorders>
+              <w:top w:val="single" w:color="CCCCCC" w:sz="1"/>
+              <w:left w:val="single" w:color="CCCCCC" w:sz="1"/>
+              <w:bottom w:val="single" w:color="CCCCCC" w:sz="1"/>
+              <w:right w:val="single" w:color="CCCCCC" w:sz="1"/>
+            </w:tcBorders>
+            <w:tcMar>
+              <w:top w:type="dxa" w:w="80"/>
+              <w:left w:type="dxa" w:w="120"/>
+              <w:bottom w:type="dxa" w:w="80"/>
+              <w:right w:type="dxa" w:w="120"/>
+            </w:tcMar>
+          </w:tcPr>
+          <w:p>
+            <w:r>
+              <w:rPr>
+                <w:b w:val="false"/>
+                <w:bCs w:val="false"/>
+              </w:rPr>
+              <w:t xml:space="preserve">Uden for scope (fil-validering)</w:t>
+            </w:r>
+          </w:p>
+        </w:tc>
+        <w:tc>
+          <w:tcPr>
+            <w:tcW w:type="dxa" w:w="1000"/>
+            <w:tcBorders>
+              <w:top w:val="single" w:color="CCCCCC" w:sz="1"/>
+              <w:left w:val="single" w:color="CCCCCC" w:sz="1"/>
+              <w:bottom w:val="single" w:color="CCCCCC" w:sz="1"/>
+              <w:right w:val="single" w:color="CCCCCC" w:sz="1"/>
+            </w:tcBorders>
+            <w:tcMar>
+              <w:top w:type="dxa" w:w="80"/>
+              <w:left w:type="dxa" w:w="120"/>
+              <w:bottom w:type="dxa" w:w="80"/>
+              <w:right w:type="dxa" w:w="120"/>
+            </w:tcMar>
+          </w:tcPr>
+          <w:p>
+            <w:r>
+              <w:rPr>
+                <w:b w:val="false"/>
+                <w:bCs w:val="false"/>
+              </w:rPr>
+              <w:t xml:space="preserve">16</w:t>
+            </w:r>
+          </w:p>
+        </w:tc>
+        <w:tc>
+          <w:tcPr>
+            <w:tcW w:type="dxa" w:w="5260"/>
+            <w:tcBorders>
+              <w:top w:val="single" w:color="CCCCCC" w:sz="1"/>
+              <w:left w:val="single" w:color="CCCCCC" w:sz="1"/>
+              <w:bottom w:val="single" w:color="CCCCCC" w:sz="1"/>
+              <w:right w:val="single" w:color="CCCCCC" w:sz="1"/>
+            </w:tcBorders>
+            <w:tcMar>
+              <w:top w:type="dxa" w:w="80"/>
+              <w:left w:type="dxa" w:w="120"/>
+              <w:bottom w:type="dxa" w:w="80"/>
+              <w:right w:type="dxa" w:w="120"/>
+            </w:tcMar>
+          </w:tcPr>
+          <w:p>
+            <w:r>
+              <w:rPr>
+                <w:b w:val="false"/>
+                <w:bCs w:val="false"/>
+              </w:rPr>
+              <w:t xml:space="preserve">Transmissions-/modtagerstatus, kryds-besked-/korrektionshistorik eller eksternt register.</w:t>
+            </w:r>
+          </w:p>
+        </w:tc>
+      </w:tr>
+      <w:tr>
+        <w:tc>
+          <w:tcPr>
+            <w:tcW w:type="dxa" w:w="3100"/>
+            <w:tcBorders>
+              <w:top w:val="single" w:color="CCCCCC" w:sz="1"/>
+              <w:left w:val="single" w:color="CCCCCC" w:sz="1"/>
+              <w:bottom w:val="single" w:color="CCCCCC" w:sz="1"/>
+              <w:right w:val="single" w:color="CCCCCC" w:sz="1"/>
+            </w:tcBorders>
+            <w:tcMar>
+              <w:top w:type="dxa" w:w="80"/>
+              <w:left w:type="dxa" w:w="120"/>
+              <w:bottom w:type="dxa" w:w="80"/>
+              <w:right w:type="dxa" w:w="120"/>
+            </w:tcMar>
+          </w:tcPr>
+          <w:p>
+            <w:r>
+              <w:rPr>
+                <w:b w:val="false"/>
+                <w:bCs w:val="false"/>
+              </w:rPr>
+              <w:t xml:space="preserve">Slået fra (2026-guidance)</w:t>
+            </w:r>
+          </w:p>
+        </w:tc>
+        <w:tc>
+          <w:tcPr>
+            <w:tcW w:type="dxa" w:w="1000"/>
+            <w:tcBorders>
+              <w:top w:val="single" w:color="CCCCCC" w:sz="1"/>
+              <w:left w:val="single" w:color="CCCCCC" w:sz="1"/>
+              <w:bottom w:val="single" w:color="CCCCCC" w:sz="1"/>
+              <w:right w:val="single" w:color="CCCCCC" w:sz="1"/>
+            </w:tcBorders>
+            <w:tcMar>
+              <w:top w:type="dxa" w:w="80"/>
+              <w:left w:type="dxa" w:w="120"/>
+              <w:bottom w:type="dxa" w:w="80"/>
+              <w:right w:type="dxa" w:w="120"/>
+            </w:tcMar>
+          </w:tcPr>
+          <w:p>
+            <w:r>
+              <w:rPr>
+                <w:b w:val="false"/>
+                <w:bCs w:val="false"/>
+              </w:rPr>
+              <w:t xml:space="preserve">4</w:t>
+            </w:r>
+          </w:p>
+        </w:tc>
+        <w:tc>
+          <w:tcPr>
+            <w:tcW w:type="dxa" w:w="5260"/>
+            <w:tcBorders>
+              <w:top w:val="single" w:color="CCCCCC" w:sz="1"/>
+              <w:left w:val="single" w:color="CCCCCC" w:sz="1"/>
+              <w:bottom w:val="single" w:color="CCCCCC" w:sz="1"/>
+              <w:right w:val="single" w:color="CCCCCC" w:sz="1"/>
+            </w:tcBorders>
+            <w:tcMar>
+              <w:top w:type="dxa" w:w="80"/>
+              <w:left w:type="dxa" w:w="120"/>
+              <w:bottom w:type="dxa" w:w="80"/>
+              <w:right w:type="dxa" w:w="120"/>
+            </w:tcMar>
+          </w:tcPr>
+          <w:p>
+            <w:r>
+              <w:rPr>
+                <w:b w:val="false"/>
+                <w:bCs w:val="false"/>
+              </w:rPr>
+              <w:t xml:space="preserve">Fyres aldrig jf. juni-2026-guidance.</w:t>
+            </w:r>
+          </w:p>
+        </w:tc>
+      </w:tr>
+    </w:tbl>
+    <w:p>
+      <w:pPr>
+        <w:spacing w:after="120"/>
+      </w:pPr>
+      <w:r>
+        <w:rPr>
+          <w:b/>
+          <w:bCs/>
+        </w:rPr>
+        <w:t xml:space="preserve">Fil-validerbare regler i alt: 143 (katalog minus switched-off og uden-for-scope). Effektivt dækket: 92 (eksekverbare + ækvivalent) = 64 %. De resterende 51 kandidater kodes batch-vis. Den fulde klassifikation pr. regel ligger i sporbarhedsmatrixen (fane "Dækningsoverblik" + "Fuldt katalog").</w:t>
+      </w:r>
+    </w:p>
+    <w:p>
+      <w:pPr>
+        <w:pStyle w:val="Heading1"/>
+      </w:pPr>
+      <w:r>
+        <w:t xml:space="preserve">5. Åbne punkter (kræver EY / eksterne beslutninger)</w:t>
       </w:r>
     </w:p>
     <w:p>
@@ -1745,7 +2280,7 @@
         <w:pStyle w:val="Heading1"/>
       </w:pPr>
       <w:r>
-        <w:t xml:space="preserve">5. Anbefalet rækkefølge mod godkendelse</w:t>
+        <w:t xml:space="preserve">6. Anbefalet rækkefølge mod godkendelse</w:t>
       </w:r>
     </w:p>
     <w:p>

</xml_diff>

<commit_message>
Regelkatalog 0.18.0: 92/163 (CEComputation-conditionals + TIN-ulighed) + pakke regenereret
</commit_message>
<xml_diff>
--- a/docs/Pillar2-Validator_Godkendelses-overblik.docx
+++ b/docs/Pillar2-Validator_Godkendelses-overblik.docx
@@ -974,7 +974,7 @@
                 <w:b w:val="false"/>
                 <w:bCs w:val="false"/>
               </w:rPr>
-              <w:t xml:space="preserve">87/163 regler eksekverbare (19 beregningsregler); datadrevet motor dækker alle check-kategorier.</w:t>
+              <w:t xml:space="preserve">92/163 regler eksekverbare (19 beregningsregler); datadrevet motor dækker alle check-kategorier.</w:t>
             </w:r>
           </w:p>
         </w:tc>
@@ -1791,7 +1791,7 @@
                 <w:b w:val="false"/>
                 <w:bCs w:val="false"/>
               </w:rPr>
-              <w:t xml:space="preserve">87</w:t>
+              <w:t xml:space="preserve">92</w:t>
             </w:r>
           </w:p>
         </w:tc>
@@ -1951,7 +1951,7 @@
                 <w:b w:val="false"/>
                 <w:bCs w:val="false"/>
               </w:rPr>
-              <w:t xml:space="preserve">51</w:t>
+              <w:t xml:space="preserve">46</w:t>
             </w:r>
           </w:p>
         </w:tc>
@@ -2152,7 +2152,7 @@
           <w:b/>
           <w:bCs/>
         </w:rPr>
-        <w:t xml:space="preserve">Fil-validerbare regler i alt: 143 (katalog minus switched-off og uden-for-scope). Effektivt dækket: 92 (eksekverbare + ækvivalent) = 64 %. De resterende 51 kandidater kodes batch-vis. Den fulde klassifikation pr. regel ligger i sporbarhedsmatrixen (fane "Dækningsoverblik" + "Fuldt katalog").</w:t>
+        <w:t xml:space="preserve">Fil-validerbare regler i alt: 143 (katalog minus switched-off og uden-for-scope). Effektivt dækket: 97 (eksekverbare + ækvivalent) = 68 %. De resterende 46 kandidater kodes batch-vis. Den fulde klassifikation pr. regel ligger i sporbarhedsmatrixen (fane "Dækningsoverblik" + "Fuldt katalog").</w:t>
       </w:r>
     </w:p>
     <w:p>

</xml_diff>

<commit_message>
Regelkatalog 0.19.0: 97/163 (kryds-sektion-conditionals) + fixtur-tests peger paa golden + pakke regenereret
</commit_message>
<xml_diff>
--- a/docs/Pillar2-Validator_Godkendelses-overblik.docx
+++ b/docs/Pillar2-Validator_Godkendelses-overblik.docx
@@ -974,7 +974,7 @@
                 <w:b w:val="false"/>
                 <w:bCs w:val="false"/>
               </w:rPr>
-              <w:t xml:space="preserve">92/163 regler eksekverbare (19 beregningsregler); datadrevet motor dækker alle check-kategorier.</w:t>
+              <w:t xml:space="preserve">97/163 regler eksekverbare (19 beregningsregler); datadrevet motor dækker alle check-kategorier.</w:t>
             </w:r>
           </w:p>
         </w:tc>
@@ -1791,7 +1791,7 @@
                 <w:b w:val="false"/>
                 <w:bCs w:val="false"/>
               </w:rPr>
-              <w:t xml:space="preserve">92</w:t>
+              <w:t xml:space="preserve">97</w:t>
             </w:r>
           </w:p>
         </w:tc>
@@ -1951,7 +1951,7 @@
                 <w:b w:val="false"/>
                 <w:bCs w:val="false"/>
               </w:rPr>
-              <w:t xml:space="preserve">46</w:t>
+              <w:t xml:space="preserve">41</w:t>
             </w:r>
           </w:p>
         </w:tc>
@@ -2152,7 +2152,7 @@
           <w:b/>
           <w:bCs/>
         </w:rPr>
-        <w:t xml:space="preserve">Fil-validerbare regler i alt: 143 (katalog minus switched-off og uden-for-scope). Effektivt dækket: 97 (eksekverbare + ækvivalent) = 68 %. De resterende 46 kandidater kodes batch-vis. Den fulde klassifikation pr. regel ligger i sporbarhedsmatrixen (fane "Dækningsoverblik" + "Fuldt katalog").</w:t>
+        <w:t xml:space="preserve">Fil-validerbare regler i alt: 143 (katalog minus switched-off og uden-for-scope). Effektivt dækket: 102 (eksekverbare + ækvivalent) = 71 %. De resterende 41 kandidater kodes batch-vis. Den fulde klassifikation pr. regel ligger i sporbarhedsmatrixen (fane "Dækningsoverblik" + "Fuldt katalog").</w:t>
       </w:r>
     </w:p>
     <w:p>

</xml_diff>